<commit_message>
feat: pcharter updated COST && CRONOGRAMA
</commit_message>
<xml_diff>
--- a/Project_Charter_Tesis.docx
+++ b/Project_Charter_Tesis.docx
@@ -2944,6 +2944,1646 @@
         </w:tc>
       </w:tr>
     </w:tbl>
+    <w:p/>
+    <w:p>
+      <w:r>
+        <w:br w:type="page"/>
+      </w:r>
+    </w:p>
+    <w:p>
+      <w:pPr>
+        <w:pStyle w:val="Heading1"/>
+      </w:pPr>
+      <w:r>
+        <w:t>Costos del proyecto</w:t>
+      </w:r>
+    </w:p>
+    <w:p>
+      <w:pPr>
+        <w:spacing w:after="120"/>
+      </w:pPr>
+      <w:r>
+        <w:rPr>
+          <w:b w:val="0"/>
+        </w:rPr>
+        <w:t>La solución tecnológica utiliza modelos de lenguaje de gran escala (LLMs) a través de APIs de pago por uso. A continuación se detallan los precios de los modelos utilizados, el costo por componente del proceso y el costo total estimado por curso generado, con base en datos reales de ejecución del sistema.</w:t>
+      </w:r>
+    </w:p>
+    <w:p>
+      <w:pPr>
+        <w:spacing w:after="120"/>
+      </w:pPr>
+      <w:r>
+        <w:rPr>
+          <w:b/>
+        </w:rPr>
+        <w:t>Precios de los modelos LLM utilizados</w:t>
+      </w:r>
+    </w:p>
+    <w:tbl>
+      <w:tblPr>
+        <w:tblStyle w:val="TableGrid"/>
+        <w:tblW w:type="auto" w:w="0"/>
+        <w:tblLook w:firstColumn="1" w:firstRow="1" w:lastColumn="0" w:lastRow="0" w:noHBand="0" w:noVBand="1" w:val="04A0"/>
+      </w:tblPr>
+      <w:tblGrid>
+        <w:gridCol w:w="3033"/>
+        <w:gridCol w:w="3033"/>
+        <w:gridCol w:w="3033"/>
+      </w:tblGrid>
+      <w:tr>
+        <w:tc>
+          <w:tcPr>
+            <w:tcW w:type="dxa" w:w="3033"/>
+            <w:shd w:val="clear" w:color="auto" w:fill="1F3864"/>
+          </w:tcPr>
+          <w:p>
+            <w:r>
+              <w:rPr>
+                <w:b/>
+                <w:color w:val="FFFFFF"/>
+              </w:rPr>
+              <w:t>Modelo</w:t>
+            </w:r>
+          </w:p>
+        </w:tc>
+        <w:tc>
+          <w:tcPr>
+            <w:tcW w:type="dxa" w:w="3033"/>
+            <w:shd w:val="clear" w:color="auto" w:fill="1F3864"/>
+          </w:tcPr>
+          <w:p>
+            <w:r>
+              <w:rPr>
+                <w:b/>
+                <w:color w:val="FFFFFF"/>
+              </w:rPr>
+              <w:t>Precio entrada (por 1M tokens)</w:t>
+            </w:r>
+          </w:p>
+        </w:tc>
+        <w:tc>
+          <w:tcPr>
+            <w:tcW w:type="dxa" w:w="3033"/>
+            <w:shd w:val="clear" w:color="auto" w:fill="1F3864"/>
+          </w:tcPr>
+          <w:p>
+            <w:r>
+              <w:rPr>
+                <w:b/>
+                <w:color w:val="FFFFFF"/>
+              </w:rPr>
+              <w:t>Precio salida (por 1M tokens)</w:t>
+            </w:r>
+          </w:p>
+        </w:tc>
+      </w:tr>
+      <w:tr>
+        <w:tc>
+          <w:tcPr>
+            <w:tcW w:type="dxa" w:w="3033"/>
+          </w:tcPr>
+          <w:p>
+            <w:r>
+              <w:t>Gemini 2.5-flash-lite (Google)</w:t>
+            </w:r>
+          </w:p>
+        </w:tc>
+        <w:tc>
+          <w:tcPr>
+            <w:tcW w:type="dxa" w:w="3033"/>
+          </w:tcPr>
+          <w:p>
+            <w:r>
+              <w:t>$0.075 USD</w:t>
+            </w:r>
+          </w:p>
+        </w:tc>
+        <w:tc>
+          <w:tcPr>
+            <w:tcW w:type="dxa" w:w="3033"/>
+          </w:tcPr>
+          <w:p>
+            <w:r>
+              <w:t>$0.30 USD</w:t>
+            </w:r>
+          </w:p>
+        </w:tc>
+      </w:tr>
+      <w:tr>
+        <w:tc>
+          <w:tcPr>
+            <w:tcW w:type="dxa" w:w="3033"/>
+          </w:tcPr>
+          <w:p>
+            <w:r>
+              <w:t>GPT-4.1-mini (OpenAI)</w:t>
+            </w:r>
+          </w:p>
+        </w:tc>
+        <w:tc>
+          <w:tcPr>
+            <w:tcW w:type="dxa" w:w="3033"/>
+          </w:tcPr>
+          <w:p>
+            <w:r>
+              <w:t>$0.40 USD</w:t>
+            </w:r>
+          </w:p>
+        </w:tc>
+        <w:tc>
+          <w:tcPr>
+            <w:tcW w:type="dxa" w:w="3033"/>
+          </w:tcPr>
+          <w:p>
+            <w:r>
+              <w:t>$1.60 USD</w:t>
+            </w:r>
+          </w:p>
+        </w:tc>
+      </w:tr>
+    </w:tbl>
+    <w:p/>
+    <w:p>
+      <w:pPr>
+        <w:spacing w:after="120"/>
+      </w:pPr>
+      <w:r>
+        <w:rPr>
+          <w:b/>
+        </w:rPr>
+        <w:t>Costo por componente del proceso (por curso — 18 semanas)</w:t>
+      </w:r>
+    </w:p>
+    <w:tbl>
+      <w:tblPr>
+        <w:tblStyle w:val="TableGrid"/>
+        <w:tblW w:type="auto" w:w="0"/>
+        <w:tblLook w:firstColumn="1" w:firstRow="1" w:lastColumn="0" w:lastRow="0" w:noHBand="0" w:noVBand="1" w:val="04A0"/>
+      </w:tblPr>
+      <w:tblGrid>
+        <w:gridCol w:w="3033"/>
+        <w:gridCol w:w="3033"/>
+        <w:gridCol w:w="3033"/>
+      </w:tblGrid>
+      <w:tr>
+        <w:tc>
+          <w:tcPr>
+            <w:tcW w:type="dxa" w:w="3033"/>
+            <w:shd w:val="clear" w:color="auto" w:fill="1F3864"/>
+          </w:tcPr>
+          <w:p>
+            <w:r>
+              <w:rPr>
+                <w:b/>
+                <w:color w:val="FFFFFF"/>
+              </w:rPr>
+              <w:t>Componente / Agente</w:t>
+            </w:r>
+          </w:p>
+        </w:tc>
+        <w:tc>
+          <w:tcPr>
+            <w:tcW w:type="dxa" w:w="3033"/>
+            <w:shd w:val="clear" w:color="auto" w:fill="1F3864"/>
+          </w:tcPr>
+          <w:p>
+            <w:r>
+              <w:rPr>
+                <w:b/>
+                <w:color w:val="FFFFFF"/>
+              </w:rPr>
+              <w:t>Fase</w:t>
+            </w:r>
+          </w:p>
+        </w:tc>
+        <w:tc>
+          <w:tcPr>
+            <w:tcW w:type="dxa" w:w="3033"/>
+            <w:shd w:val="clear" w:color="auto" w:fill="1F3864"/>
+          </w:tcPr>
+          <w:p>
+            <w:r>
+              <w:rPr>
+                <w:b/>
+                <w:color w:val="FFFFFF"/>
+              </w:rPr>
+              <w:t>Costo estimado (USD)</w:t>
+            </w:r>
+          </w:p>
+        </w:tc>
+      </w:tr>
+      <w:tr>
+        <w:tc>
+          <w:tcPr>
+            <w:tcW w:type="dxa" w:w="3033"/>
+          </w:tcPr>
+          <w:p>
+            <w:r>
+              <w:t>KickOffAgent — parseo del acta de inicio</w:t>
+            </w:r>
+          </w:p>
+        </w:tc>
+        <w:tc>
+          <w:tcPr>
+            <w:tcW w:type="dxa" w:w="3033"/>
+          </w:tcPr>
+          <w:p>
+            <w:r>
+              <w:t>Diseño</w:t>
+            </w:r>
+          </w:p>
+        </w:tc>
+        <w:tc>
+          <w:tcPr>
+            <w:tcW w:type="dxa" w:w="3033"/>
+          </w:tcPr>
+          <w:p>
+            <w:r>
+              <w:t>$0.0004</w:t>
+            </w:r>
+          </w:p>
+        </w:tc>
+      </w:tr>
+      <w:tr>
+        <w:tc>
+          <w:tcPr>
+            <w:tcW w:type="dxa" w:w="3033"/>
+          </w:tcPr>
+          <w:p>
+            <w:r>
+              <w:t>CourseSchemaAgent — contexto del curso</w:t>
+            </w:r>
+          </w:p>
+        </w:tc>
+        <w:tc>
+          <w:tcPr>
+            <w:tcW w:type="dxa" w:w="3033"/>
+          </w:tcPr>
+          <w:p>
+            <w:r>
+              <w:t>Diseño</w:t>
+            </w:r>
+          </w:p>
+        </w:tc>
+        <w:tc>
+          <w:tcPr>
+            <w:tcW w:type="dxa" w:w="3033"/>
+          </w:tcPr>
+          <w:p>
+            <w:r>
+              <w:t>$0.0001</w:t>
+            </w:r>
+          </w:p>
+        </w:tc>
+      </w:tr>
+      <w:tr>
+        <w:tc>
+          <w:tcPr>
+            <w:tcW w:type="dxa" w:w="3033"/>
+          </w:tcPr>
+          <w:p>
+            <w:r>
+              <w:t>UniteSchemaSubAgent — esquema por unidad</w:t>
+            </w:r>
+          </w:p>
+        </w:tc>
+        <w:tc>
+          <w:tcPr>
+            <w:tcW w:type="dxa" w:w="3033"/>
+          </w:tcPr>
+          <w:p>
+            <w:r>
+              <w:t>Diseño</w:t>
+            </w:r>
+          </w:p>
+        </w:tc>
+        <w:tc>
+          <w:tcPr>
+            <w:tcW w:type="dxa" w:w="3033"/>
+          </w:tcPr>
+          <w:p>
+            <w:r>
+              <w:t>$0.0037</w:t>
+            </w:r>
+          </w:p>
+        </w:tc>
+      </w:tr>
+      <w:tr>
+        <w:tc>
+          <w:tcPr>
+            <w:tcW w:type="dxa" w:w="3033"/>
+          </w:tcPr>
+          <w:p>
+            <w:r>
+              <w:t>SyllabusActivityClassifier — clasificación</w:t>
+            </w:r>
+          </w:p>
+        </w:tc>
+        <w:tc>
+          <w:tcPr>
+            <w:tcW w:type="dxa" w:w="3033"/>
+          </w:tcPr>
+          <w:p>
+            <w:r>
+              <w:t>Diseño</w:t>
+            </w:r>
+          </w:p>
+        </w:tc>
+        <w:tc>
+          <w:tcPr>
+            <w:tcW w:type="dxa" w:w="3033"/>
+          </w:tcPr>
+          <w:p>
+            <w:r>
+              <w:t>$0.0017</w:t>
+            </w:r>
+          </w:p>
+        </w:tc>
+      </w:tr>
+      <w:tr>
+        <w:tc>
+          <w:tcPr>
+            <w:tcW w:type="dxa" w:w="3033"/>
+          </w:tcPr>
+          <w:p>
+            <w:r>
+              <w:t>UniteSchemaSubAgent — actividades</w:t>
+            </w:r>
+          </w:p>
+        </w:tc>
+        <w:tc>
+          <w:tcPr>
+            <w:tcW w:type="dxa" w:w="3033"/>
+          </w:tcPr>
+          <w:p>
+            <w:r>
+              <w:t>Diseño</w:t>
+            </w:r>
+          </w:p>
+        </w:tc>
+        <w:tc>
+          <w:tcPr>
+            <w:tcW w:type="dxa" w:w="3033"/>
+          </w:tcPr>
+          <w:p>
+            <w:r>
+              <w:t>$0.0019</w:t>
+            </w:r>
+          </w:p>
+        </w:tc>
+      </w:tr>
+      <w:tr>
+        <w:tc>
+          <w:tcPr>
+            <w:tcW w:type="dxa" w:w="3033"/>
+          </w:tcPr>
+          <w:p>
+            <w:r>
+              <w:t>IpesAgent — one_step_schema_recursos (18 sem.)</w:t>
+            </w:r>
+          </w:p>
+        </w:tc>
+        <w:tc>
+          <w:tcPr>
+            <w:tcW w:type="dxa" w:w="3033"/>
+          </w:tcPr>
+          <w:p>
+            <w:r>
+              <w:t>Generación</w:t>
+            </w:r>
+          </w:p>
+        </w:tc>
+        <w:tc>
+          <w:tcPr>
+            <w:tcW w:type="dxa" w:w="3033"/>
+          </w:tcPr>
+          <w:p>
+            <w:r>
+              <w:t>$0.0045</w:t>
+            </w:r>
+          </w:p>
+        </w:tc>
+      </w:tr>
+      <w:tr>
+        <w:tc>
+          <w:tcPr>
+            <w:tcW w:type="dxa" w:w="3033"/>
+          </w:tcPr>
+          <w:p>
+            <w:r>
+              <w:t>IpesAgent — one_step_introduccion (18 sem.)</w:t>
+            </w:r>
+          </w:p>
+        </w:tc>
+        <w:tc>
+          <w:tcPr>
+            <w:tcW w:type="dxa" w:w="3033"/>
+          </w:tcPr>
+          <w:p>
+            <w:r>
+              <w:t>Generación</w:t>
+            </w:r>
+          </w:p>
+        </w:tc>
+        <w:tc>
+          <w:tcPr>
+            <w:tcW w:type="dxa" w:w="3033"/>
+          </w:tcPr>
+          <w:p>
+            <w:r>
+              <w:t>$0.0043</w:t>
+            </w:r>
+          </w:p>
+        </w:tc>
+      </w:tr>
+      <w:tr>
+        <w:tc>
+          <w:tcPr>
+            <w:tcW w:type="dxa" w:w="3033"/>
+          </w:tcPr>
+          <w:p>
+            <w:r>
+              <w:t>IpesAgent — one_step_presentaciones (18 sem.)</w:t>
+            </w:r>
+          </w:p>
+        </w:tc>
+        <w:tc>
+          <w:tcPr>
+            <w:tcW w:type="dxa" w:w="3033"/>
+          </w:tcPr>
+          <w:p>
+            <w:r>
+              <w:t>Generación</w:t>
+            </w:r>
+          </w:p>
+        </w:tc>
+        <w:tc>
+          <w:tcPr>
+            <w:tcW w:type="dxa" w:w="3033"/>
+          </w:tcPr>
+          <w:p>
+            <w:r>
+              <w:t>$0.0053</w:t>
+            </w:r>
+          </w:p>
+        </w:tc>
+      </w:tr>
+      <w:tr>
+        <w:tc>
+          <w:tcPr>
+            <w:tcW w:type="dxa" w:w="3033"/>
+          </w:tcPr>
+          <w:p>
+            <w:r>
+              <w:t>IpesAgent — one_step_ejercicios (18 sem.)</w:t>
+            </w:r>
+          </w:p>
+        </w:tc>
+        <w:tc>
+          <w:tcPr>
+            <w:tcW w:type="dxa" w:w="3033"/>
+          </w:tcPr>
+          <w:p>
+            <w:r>
+              <w:t>Generación</w:t>
+            </w:r>
+          </w:p>
+        </w:tc>
+        <w:tc>
+          <w:tcPr>
+            <w:tcW w:type="dxa" w:w="3033"/>
+          </w:tcPr>
+          <w:p>
+            <w:r>
+              <w:t>$0.0027</w:t>
+            </w:r>
+          </w:p>
+        </w:tc>
+      </w:tr>
+      <w:tr>
+        <w:tc>
+          <w:tcPr>
+            <w:tcW w:type="dxa" w:w="3033"/>
+          </w:tcPr>
+          <w:p>
+            <w:r>
+              <w:t>CheckIpesAgent — QA del contenido</w:t>
+            </w:r>
+          </w:p>
+        </w:tc>
+        <w:tc>
+          <w:tcPr>
+            <w:tcW w:type="dxa" w:w="3033"/>
+          </w:tcPr>
+          <w:p>
+            <w:r>
+              <w:t>Aseguramiento</w:t>
+            </w:r>
+          </w:p>
+        </w:tc>
+        <w:tc>
+          <w:tcPr>
+            <w:tcW w:type="dxa" w:w="3033"/>
+          </w:tcPr>
+          <w:p>
+            <w:r>
+              <w:t>$0.0002</w:t>
+            </w:r>
+          </w:p>
+        </w:tc>
+      </w:tr>
+      <w:tr>
+        <w:tc>
+          <w:tcPr>
+            <w:tcW w:type="dxa" w:w="3033"/>
+          </w:tcPr>
+          <w:p>
+            <w:r>
+              <w:rPr>
+                <w:b/>
+              </w:rPr>
+              <w:t>TOTAL IPES (sin material base)</w:t>
+            </w:r>
+          </w:p>
+        </w:tc>
+        <w:tc>
+          <w:tcPr>
+            <w:tcW w:type="dxa" w:w="3033"/>
+          </w:tcPr>
+          <w:p>
+            <w:r>
+              <w:rPr>
+                <w:b/>
+              </w:rPr>
+            </w:r>
+          </w:p>
+        </w:tc>
+        <w:tc>
+          <w:tcPr>
+            <w:tcW w:type="dxa" w:w="3033"/>
+          </w:tcPr>
+          <w:p>
+            <w:r>
+              <w:rPr>
+                <w:b/>
+              </w:rPr>
+              <w:t>~$0.025 USD</w:t>
+            </w:r>
+          </w:p>
+        </w:tc>
+      </w:tr>
+    </w:tbl>
+    <w:p/>
+    <w:p>
+      <w:pPr>
+        <w:spacing w:after="120"/>
+      </w:pPr>
+      <w:r>
+        <w:rPr>
+          <w:b/>
+        </w:rPr>
+        <w:t>Comparativa de costo: proceso manual vs. solución IA</w:t>
+      </w:r>
+    </w:p>
+    <w:tbl>
+      <w:tblPr>
+        <w:tblStyle w:val="TableGrid"/>
+        <w:tblW w:type="auto" w:w="0"/>
+        <w:tblLook w:firstColumn="1" w:firstRow="1" w:lastColumn="0" w:lastRow="0" w:noHBand="0" w:noVBand="1" w:val="04A0"/>
+      </w:tblPr>
+      <w:tblGrid>
+        <w:gridCol w:w="3033"/>
+        <w:gridCol w:w="3033"/>
+        <w:gridCol w:w="3033"/>
+      </w:tblGrid>
+      <w:tr>
+        <w:tc>
+          <w:tcPr>
+            <w:tcW w:type="dxa" w:w="3033"/>
+            <w:shd w:val="clear" w:color="auto" w:fill="1F3864"/>
+          </w:tcPr>
+          <w:p>
+            <w:r>
+              <w:rPr>
+                <w:b/>
+                <w:color w:val="FFFFFF"/>
+              </w:rPr>
+              <w:t>Proceso</w:t>
+            </w:r>
+          </w:p>
+        </w:tc>
+        <w:tc>
+          <w:tcPr>
+            <w:tcW w:type="dxa" w:w="3033"/>
+            <w:shd w:val="clear" w:color="auto" w:fill="1F3864"/>
+          </w:tcPr>
+          <w:p>
+            <w:r>
+              <w:rPr>
+                <w:b/>
+                <w:color w:val="FFFFFF"/>
+              </w:rPr>
+              <w:t>Tiempo / Costo estimado</w:t>
+            </w:r>
+          </w:p>
+        </w:tc>
+        <w:tc>
+          <w:tcPr>
+            <w:tcW w:type="dxa" w:w="3033"/>
+            <w:shd w:val="clear" w:color="auto" w:fill="1F3864"/>
+          </w:tcPr>
+          <w:p>
+            <w:r>
+              <w:rPr>
+                <w:b/>
+                <w:color w:val="FFFFFF"/>
+              </w:rPr>
+              <w:t>Observaciones</w:t>
+            </w:r>
+          </w:p>
+        </w:tc>
+      </w:tr>
+      <w:tr>
+        <w:tc>
+          <w:tcPr>
+            <w:tcW w:type="dxa" w:w="3033"/>
+          </w:tcPr>
+          <w:p>
+            <w:r>
+              <w:t>Manual (docente virtualizador)</w:t>
+            </w:r>
+          </w:p>
+        </w:tc>
+        <w:tc>
+          <w:tcPr>
+            <w:tcW w:type="dxa" w:w="3033"/>
+          </w:tcPr>
+          <w:p>
+            <w:r>
+              <w:t>~2 a 3 semanas × tarifa por hora</w:t>
+            </w:r>
+          </w:p>
+        </w:tc>
+        <w:tc>
+          <w:tcPr>
+            <w:tcW w:type="dxa" w:w="3033"/>
+          </w:tcPr>
+          <w:p>
+            <w:r>
+              <w:t>Costo variable según volumen; no escalable sin incremento proporcional de horas.</w:t>
+            </w:r>
+          </w:p>
+        </w:tc>
+      </w:tr>
+      <w:tr>
+        <w:tc>
+          <w:tcPr>
+            <w:tcW w:type="dxa" w:w="3033"/>
+          </w:tcPr>
+          <w:p>
+            <w:r>
+              <w:t>Solución IA (Gemini 2.5-flash-lite)</w:t>
+            </w:r>
+          </w:p>
+        </w:tc>
+        <w:tc>
+          <w:tcPr>
+            <w:tcW w:type="dxa" w:w="3033"/>
+          </w:tcPr>
+          <w:p>
+            <w:r>
+              <w:t>~$0.025 USD por curso (IPES)</w:t>
+              <w:br/>
+              <w:t>~$0.064 USD por curso (flujo completo)</w:t>
+            </w:r>
+          </w:p>
+        </w:tc>
+        <w:tc>
+          <w:tcPr>
+            <w:tcW w:type="dxa" w:w="3033"/>
+          </w:tcPr>
+          <w:p>
+            <w:r>
+              <w:t>Costo fijo por ejecución, independiente del número de cursos procesados en paralelo.</w:t>
+            </w:r>
+          </w:p>
+        </w:tc>
+      </w:tr>
+    </w:tbl>
+    <w:p>
+      <w:pPr>
+        <w:spacing w:after="120"/>
+      </w:pPr>
+      <w:r>
+        <w:rPr>
+          <w:b w:val="0"/>
+        </w:rPr>
+        <w:t>Nota: Los costos presentados se basan en datos reales obtenidos del registro de tokens del sistema (token_usage.jsonl), correspondientes a 566 llamadas de ejecución. El costo de $0.025 USD corresponde únicamente a la generación de materiales IPES (Introducción, Presentaciones y Ejercicios). El costo de $0.064 USD incluye adicionalmente la generación del material base de referencia (genera_material_base), que es opcional en el flujo de producción.</w:t>
+      </w:r>
+    </w:p>
+    <w:p/>
+    <w:p>
+      <w:r>
+        <w:br w:type="page"/>
+      </w:r>
+    </w:p>
+    <w:p>
+      <w:pPr>
+        <w:pStyle w:val="Heading1"/>
+      </w:pPr>
+      <w:r>
+        <w:t>Cronograma del proyecto</w:t>
+      </w:r>
+    </w:p>
+    <w:p>
+      <w:pPr>
+        <w:spacing w:after="120"/>
+      </w:pPr>
+      <w:r>
+        <w:rPr>
+          <w:b w:val="0"/>
+        </w:rPr>
+        <w:t>El proyecto se ejecutará entre mayo y septiembre de 2026, organizado en cuatro fases alineadas a los objetivos específicos del trabajo de suficiencia profesional. Cada fase se desarrolla en sprints de dos semanas siguiendo la metodología Scrum.</w:t>
+      </w:r>
+    </w:p>
+    <w:tbl>
+      <w:tblPr>
+        <w:tblStyle w:val="TableGrid"/>
+        <w:tblW w:type="auto" w:w="0"/>
+        <w:tblLook w:firstColumn="1" w:firstRow="1" w:lastColumn="0" w:lastRow="0" w:noHBand="0" w:noVBand="1" w:val="04A0"/>
+      </w:tblPr>
+      <w:tblGrid>
+        <w:gridCol w:w="1820"/>
+        <w:gridCol w:w="1820"/>
+        <w:gridCol w:w="1820"/>
+        <w:gridCol w:w="1820"/>
+        <w:gridCol w:w="1820"/>
+      </w:tblGrid>
+      <w:tr>
+        <w:tc>
+          <w:tcPr>
+            <w:tcW w:type="dxa" w:w="1820"/>
+            <w:shd w:val="clear" w:color="auto" w:fill="1F3864"/>
+          </w:tcPr>
+          <w:p>
+            <w:r>
+              <w:rPr>
+                <w:b/>
+                <w:color w:val="FFFFFF"/>
+              </w:rPr>
+              <w:t>Sprint</w:t>
+            </w:r>
+          </w:p>
+        </w:tc>
+        <w:tc>
+          <w:tcPr>
+            <w:tcW w:type="dxa" w:w="1820"/>
+            <w:shd w:val="clear" w:color="auto" w:fill="1F3864"/>
+          </w:tcPr>
+          <w:p>
+            <w:r>
+              <w:rPr>
+                <w:b/>
+                <w:color w:val="FFFFFF"/>
+              </w:rPr>
+              <w:t>Período</w:t>
+            </w:r>
+          </w:p>
+        </w:tc>
+        <w:tc>
+          <w:tcPr>
+            <w:tcW w:type="dxa" w:w="1820"/>
+            <w:shd w:val="clear" w:color="auto" w:fill="1F3864"/>
+          </w:tcPr>
+          <w:p>
+            <w:r>
+              <w:rPr>
+                <w:b/>
+                <w:color w:val="FFFFFF"/>
+              </w:rPr>
+              <w:t>Fase / OE</w:t>
+            </w:r>
+          </w:p>
+        </w:tc>
+        <w:tc>
+          <w:tcPr>
+            <w:tcW w:type="dxa" w:w="1820"/>
+            <w:shd w:val="clear" w:color="auto" w:fill="1F3864"/>
+          </w:tcPr>
+          <w:p>
+            <w:r>
+              <w:rPr>
+                <w:b/>
+                <w:color w:val="FFFFFF"/>
+              </w:rPr>
+              <w:t>Actividades principales</w:t>
+            </w:r>
+          </w:p>
+        </w:tc>
+        <w:tc>
+          <w:tcPr>
+            <w:tcW w:type="dxa" w:w="1820"/>
+            <w:shd w:val="clear" w:color="auto" w:fill="1F3864"/>
+          </w:tcPr>
+          <w:p>
+            <w:r>
+              <w:rPr>
+                <w:b/>
+                <w:color w:val="FFFFFF"/>
+              </w:rPr>
+              <w:t>Entregable</w:t>
+            </w:r>
+          </w:p>
+        </w:tc>
+      </w:tr>
+      <w:tr>
+        <w:tc>
+          <w:tcPr>
+            <w:tcW w:type="dxa" w:w="1820"/>
+          </w:tcPr>
+          <w:p>
+            <w:r>
+              <w:t>Sprint 1</w:t>
+            </w:r>
+          </w:p>
+        </w:tc>
+        <w:tc>
+          <w:tcPr>
+            <w:tcW w:type="dxa" w:w="1820"/>
+          </w:tcPr>
+          <w:p>
+            <w:r>
+              <w:t>May 05 – May 18</w:t>
+            </w:r>
+          </w:p>
+        </w:tc>
+        <w:tc>
+          <w:tcPr>
+            <w:tcW w:type="dxa" w:w="1820"/>
+          </w:tcPr>
+          <w:p>
+            <w:r>
+              <w:t>OE1 — Análisis</w:t>
+            </w:r>
+          </w:p>
+        </w:tc>
+        <w:tc>
+          <w:tcPr>
+            <w:tcW w:type="dxa" w:w="1820"/>
+          </w:tcPr>
+          <w:p>
+            <w:r>
+              <w:t>Revisión bibliográfica de LLMs en educación.</w:t>
+              <w:br/>
+              <w:t>Análisis de tecnologías: GPT-4.1-mini, Gemini 2.5-flash-lite, LangGraph.</w:t>
+            </w:r>
+          </w:p>
+        </w:tc>
+        <w:tc>
+          <w:tcPr>
+            <w:tcW w:type="dxa" w:w="1820"/>
+          </w:tcPr>
+          <w:p>
+            <w:r>
+              <w:t>Informe de análisis de tecnologías (borrador)</w:t>
+            </w:r>
+          </w:p>
+        </w:tc>
+      </w:tr>
+      <w:tr>
+        <w:tc>
+          <w:tcPr>
+            <w:tcW w:type="dxa" w:w="1820"/>
+          </w:tcPr>
+          <w:p>
+            <w:r>
+              <w:t>Sprint 2</w:t>
+            </w:r>
+          </w:p>
+        </w:tc>
+        <w:tc>
+          <w:tcPr>
+            <w:tcW w:type="dxa" w:w="1820"/>
+          </w:tcPr>
+          <w:p>
+            <w:r>
+              <w:t>May 19 – Jun 01</w:t>
+            </w:r>
+          </w:p>
+        </w:tc>
+        <w:tc>
+          <w:tcPr>
+            <w:tcW w:type="dxa" w:w="1820"/>
+          </w:tcPr>
+          <w:p>
+            <w:r>
+              <w:t>OE1 — Análisis</w:t>
+            </w:r>
+          </w:p>
+        </w:tc>
+        <w:tc>
+          <w:tcPr>
+            <w:tcW w:type="dxa" w:w="1820"/>
+          </w:tcPr>
+          <w:p>
+            <w:r>
+              <w:t>Análisis del proceso actual de virtualización.</w:t>
+              <w:br/>
+              <w:t>Documentación del problema y antecedentes.</w:t>
+            </w:r>
+          </w:p>
+        </w:tc>
+        <w:tc>
+          <w:tcPr>
+            <w:tcW w:type="dxa" w:w="1820"/>
+          </w:tcPr>
+          <w:p>
+            <w:r>
+              <w:t>Informe de análisis aprobado (IE1)</w:t>
+            </w:r>
+          </w:p>
+        </w:tc>
+      </w:tr>
+      <w:tr>
+        <w:tc>
+          <w:tcPr>
+            <w:tcW w:type="dxa" w:w="1820"/>
+          </w:tcPr>
+          <w:p>
+            <w:r>
+              <w:t>Sprint 3</w:t>
+            </w:r>
+          </w:p>
+        </w:tc>
+        <w:tc>
+          <w:tcPr>
+            <w:tcW w:type="dxa" w:w="1820"/>
+          </w:tcPr>
+          <w:p>
+            <w:r>
+              <w:t>Jun 02 – Jun 15</w:t>
+            </w:r>
+          </w:p>
+        </w:tc>
+        <w:tc>
+          <w:tcPr>
+            <w:tcW w:type="dxa" w:w="1820"/>
+          </w:tcPr>
+          <w:p>
+            <w:r>
+              <w:t>OE2 — Diseño</w:t>
+            </w:r>
+          </w:p>
+        </w:tc>
+        <w:tc>
+          <w:tcPr>
+            <w:tcW w:type="dxa" w:w="1820"/>
+          </w:tcPr>
+          <w:p>
+            <w:r>
+              <w:t>Diseño de la arquitectura multi-agente.</w:t>
+              <w:br/>
+              <w:t>Definición de fases: Diseño, Aseguramiento, Generación.</w:t>
+            </w:r>
+          </w:p>
+        </w:tc>
+        <w:tc>
+          <w:tcPr>
+            <w:tcW w:type="dxa" w:w="1820"/>
+          </w:tcPr>
+          <w:p>
+            <w:r>
+              <w:t>Diagrama de arquitectura (borrador)</w:t>
+            </w:r>
+          </w:p>
+        </w:tc>
+      </w:tr>
+      <w:tr>
+        <w:tc>
+          <w:tcPr>
+            <w:tcW w:type="dxa" w:w="1820"/>
+          </w:tcPr>
+          <w:p>
+            <w:r>
+              <w:t>Sprint 4</w:t>
+            </w:r>
+          </w:p>
+        </w:tc>
+        <w:tc>
+          <w:tcPr>
+            <w:tcW w:type="dxa" w:w="1820"/>
+          </w:tcPr>
+          <w:p>
+            <w:r>
+              <w:t>Jun 16 – Jun 29</w:t>
+            </w:r>
+          </w:p>
+        </w:tc>
+        <w:tc>
+          <w:tcPr>
+            <w:tcW w:type="dxa" w:w="1820"/>
+          </w:tcPr>
+          <w:p>
+            <w:r>
+              <w:t>OE2 — Diseño</w:t>
+            </w:r>
+          </w:p>
+        </w:tc>
+        <w:tc>
+          <w:tcPr>
+            <w:tcW w:type="dxa" w:w="1820"/>
+          </w:tcPr>
+          <w:p>
+            <w:r>
+              <w:t>Diseño detallado de agentes: KickOffAgent, CourseSchemaAgent, IpesAgent, CheckIpesAgent.</w:t>
+              <w:br/>
+              <w:t>Diagramas de flujo del proceso.</w:t>
+            </w:r>
+          </w:p>
+        </w:tc>
+        <w:tc>
+          <w:tcPr>
+            <w:tcW w:type="dxa" w:w="1820"/>
+          </w:tcPr>
+          <w:p>
+            <w:r>
+              <w:t>Arquitectura aprobada (IE2)</w:t>
+            </w:r>
+          </w:p>
+        </w:tc>
+      </w:tr>
+      <w:tr>
+        <w:tc>
+          <w:tcPr>
+            <w:tcW w:type="dxa" w:w="1820"/>
+          </w:tcPr>
+          <w:p>
+            <w:r>
+              <w:t>Sprint 5</w:t>
+            </w:r>
+          </w:p>
+        </w:tc>
+        <w:tc>
+          <w:tcPr>
+            <w:tcW w:type="dxa" w:w="1820"/>
+          </w:tcPr>
+          <w:p>
+            <w:r>
+              <w:t>Jun 30 – Jul 13</w:t>
+            </w:r>
+          </w:p>
+        </w:tc>
+        <w:tc>
+          <w:tcPr>
+            <w:tcW w:type="dxa" w:w="1820"/>
+          </w:tcPr>
+          <w:p>
+            <w:r>
+              <w:t>OE3 — Implementación</w:t>
+            </w:r>
+          </w:p>
+        </w:tc>
+        <w:tc>
+          <w:tcPr>
+            <w:tcW w:type="dxa" w:w="1820"/>
+          </w:tcPr>
+          <w:p>
+            <w:r>
+              <w:t>Implementación de KickOffAgent y SyllabusActivityClassifier.</w:t>
+              <w:br/>
+              <w:t>Pruebas unitarias de parseo de documentos de entrada.</w:t>
+            </w:r>
+          </w:p>
+        </w:tc>
+        <w:tc>
+          <w:tcPr>
+            <w:tcW w:type="dxa" w:w="1820"/>
+          </w:tcPr>
+          <w:p>
+            <w:r>
+              <w:t>Agentes de diseño funcionales</w:t>
+            </w:r>
+          </w:p>
+        </w:tc>
+      </w:tr>
+      <w:tr>
+        <w:tc>
+          <w:tcPr>
+            <w:tcW w:type="dxa" w:w="1820"/>
+          </w:tcPr>
+          <w:p>
+            <w:r>
+              <w:t>Sprint 6</w:t>
+            </w:r>
+          </w:p>
+        </w:tc>
+        <w:tc>
+          <w:tcPr>
+            <w:tcW w:type="dxa" w:w="1820"/>
+          </w:tcPr>
+          <w:p>
+            <w:r>
+              <w:t>Jul 14 – Jul 27</w:t>
+            </w:r>
+          </w:p>
+        </w:tc>
+        <w:tc>
+          <w:tcPr>
+            <w:tcW w:type="dxa" w:w="1820"/>
+          </w:tcPr>
+          <w:p>
+            <w:r>
+              <w:t>OE3 — Implementación</w:t>
+            </w:r>
+          </w:p>
+        </w:tc>
+        <w:tc>
+          <w:tcPr>
+            <w:tcW w:type="dxa" w:w="1820"/>
+          </w:tcPr>
+          <w:p>
+            <w:r>
+              <w:t>Implementación de CourseSchemaAgent y UniteSchemaSubAgent.</w:t>
+              <w:br/>
+              <w:t>Pruebas con sílabos reales.</w:t>
+            </w:r>
+          </w:p>
+        </w:tc>
+        <w:tc>
+          <w:tcPr>
+            <w:tcW w:type="dxa" w:w="1820"/>
+          </w:tcPr>
+          <w:p>
+            <w:r>
+              <w:t>Fase Diseño implementada</w:t>
+            </w:r>
+          </w:p>
+        </w:tc>
+      </w:tr>
+      <w:tr>
+        <w:tc>
+          <w:tcPr>
+            <w:tcW w:type="dxa" w:w="1820"/>
+          </w:tcPr>
+          <w:p>
+            <w:r>
+              <w:t>Sprint 7</w:t>
+            </w:r>
+          </w:p>
+        </w:tc>
+        <w:tc>
+          <w:tcPr>
+            <w:tcW w:type="dxa" w:w="1820"/>
+          </w:tcPr>
+          <w:p>
+            <w:r>
+              <w:t>Jul 28 – Aug 10</w:t>
+            </w:r>
+          </w:p>
+        </w:tc>
+        <w:tc>
+          <w:tcPr>
+            <w:tcW w:type="dxa" w:w="1820"/>
+          </w:tcPr>
+          <w:p>
+            <w:r>
+              <w:t>OE3 — Implementación</w:t>
+            </w:r>
+          </w:p>
+        </w:tc>
+        <w:tc>
+          <w:tcPr>
+            <w:tcW w:type="dxa" w:w="1820"/>
+          </w:tcPr>
+          <w:p>
+            <w:r>
+              <w:t>Implementación de IpesAgent (Introducción, Presentaciones, Ejercicios).</w:t>
+              <w:br/>
+              <w:t>Implementación de CheckIpesAgent y TimeRevisor.</w:t>
+            </w:r>
+          </w:p>
+        </w:tc>
+        <w:tc>
+          <w:tcPr>
+            <w:tcW w:type="dxa" w:w="1820"/>
+          </w:tcPr>
+          <w:p>
+            <w:r>
+              <w:t>Fase Generación implementada</w:t>
+            </w:r>
+          </w:p>
+        </w:tc>
+      </w:tr>
+      <w:tr>
+        <w:tc>
+          <w:tcPr>
+            <w:tcW w:type="dxa" w:w="1820"/>
+          </w:tcPr>
+          <w:p>
+            <w:r>
+              <w:t>Sprint 8</w:t>
+            </w:r>
+          </w:p>
+        </w:tc>
+        <w:tc>
+          <w:tcPr>
+            <w:tcW w:type="dxa" w:w="1820"/>
+          </w:tcPr>
+          <w:p>
+            <w:r>
+              <w:t>Aug 11 – Aug 24</w:t>
+            </w:r>
+          </w:p>
+        </w:tc>
+        <w:tc>
+          <w:tcPr>
+            <w:tcW w:type="dxa" w:w="1820"/>
+          </w:tcPr>
+          <w:p>
+            <w:r>
+              <w:t>OE3 — Validación</w:t>
+            </w:r>
+          </w:p>
+        </w:tc>
+        <w:tc>
+          <w:tcPr>
+            <w:tcW w:type="dxa" w:w="1820"/>
+          </w:tcPr>
+          <w:p>
+            <w:r>
+              <w:t>Ejecución del sistema con cursos de prueba.</w:t>
+              <w:br/>
+              <w:t>Evaluación del contenido por docentes revisores mediante rúbrica de calidad.</w:t>
+            </w:r>
+          </w:p>
+        </w:tc>
+        <w:tc>
+          <w:tcPr>
+            <w:tcW w:type="dxa" w:w="1820"/>
+          </w:tcPr>
+          <w:p>
+            <w:r>
+              <w:t>Resultados de validación (borrador)</w:t>
+            </w:r>
+          </w:p>
+        </w:tc>
+      </w:tr>
+      <w:tr>
+        <w:tc>
+          <w:tcPr>
+            <w:tcW w:type="dxa" w:w="1820"/>
+          </w:tcPr>
+          <w:p>
+            <w:r>
+              <w:t>Sprint 9</w:t>
+            </w:r>
+          </w:p>
+        </w:tc>
+        <w:tc>
+          <w:tcPr>
+            <w:tcW w:type="dxa" w:w="1820"/>
+          </w:tcPr>
+          <w:p>
+            <w:r>
+              <w:t>Aug 25 – Sep 07</w:t>
+            </w:r>
+          </w:p>
+        </w:tc>
+        <w:tc>
+          <w:tcPr>
+            <w:tcW w:type="dxa" w:w="1820"/>
+          </w:tcPr>
+          <w:p>
+            <w:r>
+              <w:t>OE3 — Validación</w:t>
+            </w:r>
+          </w:p>
+        </w:tc>
+        <w:tc>
+          <w:tcPr>
+            <w:tcW w:type="dxa" w:w="1820"/>
+          </w:tcPr>
+          <w:p>
+            <w:r>
+              <w:t>Análisis comparativo: tiempo y costo IA vs. proceso manual.</w:t>
+              <w:br/>
+              <w:t>Ajustes finales a los agentes según retroalimentación de revisores.</w:t>
+            </w:r>
+          </w:p>
+        </w:tc>
+        <w:tc>
+          <w:tcPr>
+            <w:tcW w:type="dxa" w:w="1820"/>
+          </w:tcPr>
+          <w:p>
+            <w:r>
+              <w:t>Validación aprobada (IE3)</w:t>
+            </w:r>
+          </w:p>
+        </w:tc>
+      </w:tr>
+      <w:tr>
+        <w:tc>
+          <w:tcPr>
+            <w:tcW w:type="dxa" w:w="1820"/>
+          </w:tcPr>
+          <w:p>
+            <w:r>
+              <w:t>Sprint 10</w:t>
+            </w:r>
+          </w:p>
+        </w:tc>
+        <w:tc>
+          <w:tcPr>
+            <w:tcW w:type="dxa" w:w="1820"/>
+          </w:tcPr>
+          <w:p>
+            <w:r>
+              <w:t>Sep 08 – Sep 21</w:t>
+            </w:r>
+          </w:p>
+        </w:tc>
+        <w:tc>
+          <w:tcPr>
+            <w:tcW w:type="dxa" w:w="1820"/>
+          </w:tcPr>
+          <w:p>
+            <w:r>
+              <w:t>OE4 — Continuidad</w:t>
+            </w:r>
+          </w:p>
+        </w:tc>
+        <w:tc>
+          <w:tcPr>
+            <w:tcW w:type="dxa" w:w="1820"/>
+          </w:tcPr>
+          <w:p>
+            <w:r>
+              <w:t>Elaboración del plan de continuidad: roles de soporte, niveles de servicio, gestión de riesgos.</w:t>
+            </w:r>
+          </w:p>
+        </w:tc>
+        <w:tc>
+          <w:tcPr>
+            <w:tcW w:type="dxa" w:w="1820"/>
+          </w:tcPr>
+          <w:p>
+            <w:r>
+              <w:t>Plan de continuidad (borrador)</w:t>
+            </w:r>
+          </w:p>
+        </w:tc>
+      </w:tr>
+      <w:tr>
+        <w:tc>
+          <w:tcPr>
+            <w:tcW w:type="dxa" w:w="1820"/>
+          </w:tcPr>
+          <w:p>
+            <w:r>
+              <w:t>Sprint 11</w:t>
+            </w:r>
+          </w:p>
+        </w:tc>
+        <w:tc>
+          <w:tcPr>
+            <w:tcW w:type="dxa" w:w="1820"/>
+          </w:tcPr>
+          <w:p>
+            <w:r>
+              <w:t>Sep 22 – Sep 30</w:t>
+            </w:r>
+          </w:p>
+        </w:tc>
+        <w:tc>
+          <w:tcPr>
+            <w:tcW w:type="dxa" w:w="1820"/>
+          </w:tcPr>
+          <w:p>
+            <w:r>
+              <w:t>OE4 — Continuidad</w:t>
+            </w:r>
+          </w:p>
+        </w:tc>
+        <w:tc>
+          <w:tcPr>
+            <w:tcW w:type="dxa" w:w="1820"/>
+          </w:tcPr>
+          <w:p>
+            <w:r>
+              <w:t>Revisión final del plan de continuidad.</w:t>
+              <w:br/>
+              <w:t>Cierre de documentación del trabajo de suficiencia.</w:t>
+            </w:r>
+          </w:p>
+        </w:tc>
+        <w:tc>
+          <w:tcPr>
+            <w:tcW w:type="dxa" w:w="1820"/>
+          </w:tcPr>
+          <w:p>
+            <w:r>
+              <w:t>Plan de continuidad aprobado (IE4)</w:t>
+            </w:r>
+          </w:p>
+        </w:tc>
+      </w:tr>
+      <w:tr>
+        <w:tc>
+          <w:tcPr>
+            <w:tcW w:type="dxa" w:w="1820"/>
+          </w:tcPr>
+          <w:p>
+            <w:r>
+              <w:t>Cierre</w:t>
+            </w:r>
+          </w:p>
+        </w:tc>
+        <w:tc>
+          <w:tcPr>
+            <w:tcW w:type="dxa" w:w="1820"/>
+          </w:tcPr>
+          <w:p>
+            <w:r>
+              <w:t>Octubre 2026</w:t>
+            </w:r>
+          </w:p>
+        </w:tc>
+        <w:tc>
+          <w:tcPr>
+            <w:tcW w:type="dxa" w:w="1820"/>
+          </w:tcPr>
+          <w:p>
+            <w:r>
+              <w:t>Entrega final</w:t>
+            </w:r>
+          </w:p>
+        </w:tc>
+        <w:tc>
+          <w:tcPr>
+            <w:tcW w:type="dxa" w:w="1820"/>
+          </w:tcPr>
+          <w:p>
+            <w:r>
+              <w:t>Consolidación del informe final.</w:t>
+              <w:br/>
+              <w:t>Presentación ante el asesor académico.</w:t>
+            </w:r>
+          </w:p>
+        </w:tc>
+        <w:tc>
+          <w:tcPr>
+            <w:tcW w:type="dxa" w:w="1820"/>
+          </w:tcPr>
+          <w:p>
+            <w:r>
+              <w:t>Trabajo de Suficiencia Profesional entregado</w:t>
+            </w:r>
+          </w:p>
+        </w:tc>
+      </w:tr>
+      <w:tr>
+        <w:tc>
+          <w:tcPr>
+            <w:tcW w:type="dxa" w:w="1820"/>
+          </w:tcPr>
+          <w:p/>
+        </w:tc>
+        <w:tc>
+          <w:tcPr>
+            <w:tcW w:type="dxa" w:w="1820"/>
+          </w:tcPr>
+          <w:p/>
+        </w:tc>
+        <w:tc>
+          <w:tcPr>
+            <w:tcW w:type="dxa" w:w="1820"/>
+          </w:tcPr>
+          <w:p/>
+        </w:tc>
+        <w:tc>
+          <w:tcPr>
+            <w:tcW w:type="dxa" w:w="1820"/>
+          </w:tcPr>
+          <w:p/>
+        </w:tc>
+        <w:tc>
+          <w:tcPr>
+            <w:tcW w:type="dxa" w:w="1820"/>
+          </w:tcPr>
+          <w:p/>
+        </w:tc>
+      </w:tr>
+      <w:tr>
+        <w:tc>
+          <w:tcPr>
+            <w:tcW w:type="dxa" w:w="1820"/>
+          </w:tcPr>
+          <w:p/>
+        </w:tc>
+        <w:tc>
+          <w:tcPr>
+            <w:tcW w:type="dxa" w:w="1820"/>
+          </w:tcPr>
+          <w:p/>
+        </w:tc>
+        <w:tc>
+          <w:tcPr>
+            <w:tcW w:type="dxa" w:w="1820"/>
+          </w:tcPr>
+          <w:p/>
+        </w:tc>
+        <w:tc>
+          <w:tcPr>
+            <w:tcW w:type="dxa" w:w="1820"/>
+          </w:tcPr>
+          <w:p/>
+        </w:tc>
+        <w:tc>
+          <w:tcPr>
+            <w:tcW w:type="dxa" w:w="1820"/>
+          </w:tcPr>
+          <w:p/>
+        </w:tc>
+      </w:tr>
+      <w:tr>
+        <w:tc>
+          <w:tcPr>
+            <w:tcW w:type="dxa" w:w="1820"/>
+          </w:tcPr>
+          <w:p/>
+        </w:tc>
+        <w:tc>
+          <w:tcPr>
+            <w:tcW w:type="dxa" w:w="1820"/>
+          </w:tcPr>
+          <w:p/>
+        </w:tc>
+        <w:tc>
+          <w:tcPr>
+            <w:tcW w:type="dxa" w:w="1820"/>
+          </w:tcPr>
+          <w:p/>
+        </w:tc>
+        <w:tc>
+          <w:tcPr>
+            <w:tcW w:type="dxa" w:w="1820"/>
+          </w:tcPr>
+          <w:p/>
+        </w:tc>
+        <w:tc>
+          <w:tcPr>
+            <w:tcW w:type="dxa" w:w="1820"/>
+          </w:tcPr>
+          <w:p/>
+        </w:tc>
+      </w:tr>
+      <w:tr>
+        <w:tc>
+          <w:tcPr>
+            <w:tcW w:type="dxa" w:w="1820"/>
+          </w:tcPr>
+          <w:p/>
+        </w:tc>
+        <w:tc>
+          <w:tcPr>
+            <w:tcW w:type="dxa" w:w="1820"/>
+          </w:tcPr>
+          <w:p/>
+        </w:tc>
+        <w:tc>
+          <w:tcPr>
+            <w:tcW w:type="dxa" w:w="1820"/>
+          </w:tcPr>
+          <w:p/>
+        </w:tc>
+        <w:tc>
+          <w:tcPr>
+            <w:tcW w:type="dxa" w:w="1820"/>
+          </w:tcPr>
+          <w:p/>
+        </w:tc>
+        <w:tc>
+          <w:tcPr>
+            <w:tcW w:type="dxa" w:w="1820"/>
+          </w:tcPr>
+          <w:p/>
+        </w:tc>
+      </w:tr>
+    </w:tbl>
+    <w:p/>
+    <w:p>
+      <w:pPr>
+        <w:spacing w:after="120"/>
+      </w:pPr>
+      <w:r>
+        <w:rPr>
+          <w:b w:val="0"/>
+        </w:rPr>
+        <w:t>Nota: Las fechas son estimadas y podrán ajustarse según el calendario académico del Programa de Titulación UPC 2026. Los sprints de validación (OE3) están sujetos a la disponibilidad de los docentes revisores.</w:t>
+      </w:r>
+    </w:p>
     <w:p/>
     <w:p>
       <w:r>

</xml_diff>

<commit_message>
fix: remove total row from op costs, add HP EliteBook Pro price
Co-Authored-By: Claude Sonnet 4.6 <noreply@anthropic.com>
</commit_message>
<xml_diff>
--- a/Project_Charter_Tesis.docx
+++ b/Project_Charter_Tesis.docx
@@ -3991,59 +3991,6 @@
           </w:p>
         </w:tc>
       </w:tr>
-      <w:tr>
-        <w:tc>
-          <w:tcPr>
-            <w:tcW w:type="dxa" w:w="2275"/>
-          </w:tcPr>
-          <w:p>
-            <w:r>
-              <w:rPr>
-                <w:b/>
-              </w:rPr>
-              <w:t>TOTAL</w:t>
-            </w:r>
-          </w:p>
-        </w:tc>
-        <w:tc>
-          <w:tcPr>
-            <w:tcW w:type="dxa" w:w="2275"/>
-          </w:tcPr>
-          <w:p>
-            <w:r>
-              <w:rPr>
-                <w:b/>
-              </w:rPr>
-              <w:t>720 hrs</w:t>
-            </w:r>
-          </w:p>
-        </w:tc>
-        <w:tc>
-          <w:tcPr>
-            <w:tcW w:type="dxa" w:w="2275"/>
-          </w:tcPr>
-          <w:p>
-            <w:r>
-              <w:rPr>
-                <w:b/>
-              </w:rPr>
-            </w:r>
-          </w:p>
-        </w:tc>
-        <w:tc>
-          <w:tcPr>
-            <w:tcW w:type="dxa" w:w="2275"/>
-          </w:tcPr>
-          <w:p>
-            <w:r>
-              <w:rPr>
-                <w:b/>
-              </w:rPr>
-              <w:t>S/. 24,250</w:t>
-            </w:r>
-          </w:p>
-        </w:tc>
-      </w:tr>
     </w:tbl>
     <w:p/>
     <w:p>
@@ -4064,14 +4011,15 @@
         <w:tblLook w:firstColumn="1" w:firstRow="1" w:lastColumn="0" w:lastRow="0" w:noHBand="0" w:noVBand="1" w:val="04A0"/>
       </w:tblPr>
       <w:tblGrid>
-        <w:gridCol w:w="3033"/>
-        <w:gridCol w:w="3033"/>
-        <w:gridCol w:w="3033"/>
+        <w:gridCol w:w="2275"/>
+        <w:gridCol w:w="2275"/>
+        <w:gridCol w:w="2275"/>
+        <w:gridCol w:w="2275"/>
       </w:tblGrid>
       <w:tr>
         <w:tc>
           <w:tcPr>
-            <w:tcW w:type="dxa" w:w="3033"/>
+            <w:tcW w:type="dxa" w:w="2275"/>
             <w:shd w:val="clear" w:color="auto" w:fill="1F3864"/>
           </w:tcPr>
           <w:p>
@@ -4086,7 +4034,7 @@
         </w:tc>
         <w:tc>
           <w:tcPr>
-            <w:tcW w:type="dxa" w:w="3033"/>
+            <w:tcW w:type="dxa" w:w="2275"/>
             <w:shd w:val="clear" w:color="auto" w:fill="1F3864"/>
           </w:tcPr>
           <w:p>
@@ -4101,7 +4049,7 @@
         </w:tc>
         <w:tc>
           <w:tcPr>
-            <w:tcW w:type="dxa" w:w="3033"/>
+            <w:tcW w:type="dxa" w:w="2275"/>
             <w:shd w:val="clear" w:color="auto" w:fill="1F3864"/>
           </w:tcPr>
           <w:p>
@@ -4114,11 +4062,26 @@
             </w:r>
           </w:p>
         </w:tc>
+        <w:tc>
+          <w:tcPr>
+            <w:tcW w:type="dxa" w:w="2275"/>
+            <w:shd w:val="clear" w:color="auto" w:fill="1F3864"/>
+          </w:tcPr>
+          <w:p>
+            <w:r>
+              <w:rPr>
+                <w:b/>
+                <w:color w:val="FFFFFF"/>
+              </w:rPr>
+              <w:t>Precio referencial (S/.)</w:t>
+            </w:r>
+          </w:p>
+        </w:tc>
       </w:tr>
       <w:tr>
         <w:tc>
           <w:tcPr>
-            <w:tcW w:type="dxa" w:w="3033"/>
+            <w:tcW w:type="dxa" w:w="2275"/>
           </w:tcPr>
           <w:p>
             <w:r>
@@ -4128,7 +4091,7 @@
         </w:tc>
         <w:tc>
           <w:tcPr>
-            <w:tcW w:type="dxa" w:w="3033"/>
+            <w:tcW w:type="dxa" w:w="2275"/>
           </w:tcPr>
           <w:p>
             <w:r>
@@ -4138,11 +4101,21 @@
         </w:tc>
         <w:tc>
           <w:tcPr>
-            <w:tcW w:type="dxa" w:w="3033"/>
+            <w:tcW w:type="dxa" w:w="2275"/>
           </w:tcPr>
           <w:p>
             <w:r>
               <w:t>1 unidad</w:t>
+            </w:r>
+          </w:p>
+        </w:tc>
+        <w:tc>
+          <w:tcPr>
+            <w:tcW w:type="dxa" w:w="2275"/>
+          </w:tcPr>
+          <w:p>
+            <w:r>
+              <w:t>S/. 5,500</w:t>
             </w:r>
           </w:p>
         </w:tc>

</xml_diff>